<commit_message>
Version ultime AGTS : - Base second + bonnes parties first - GPS réel prioritaire (chauffeur sur tel) - Simulation fallback - PWA installable (ajout écran d'accueil) - Route fidèle Marcory → Koumassi → Bassam - ETA dynamique personnalisée étudiant - Toast bus proche - Partage position Google Maps direct mobile - Fixes CSS/PostCSS/syntaxe (zéro erreur console) - Vite stable + overlay désactivé
</commit_message>
<xml_diff>
--- a/PRESENTATION/Presentation_IIT_AGTS.docx
+++ b/PRESENTATION/Presentation_IIT_AGTS.docx
@@ -284,17 +284,7 @@
           <w:szCs w:val="24"/>
           <w:lang w:val="fr-FR"/>
         </w:rPr>
-        <w:t xml:space="preserve"> </w:t>
-      </w:r>
-      <w:r>
-        <w:rPr>
-          <w:rFonts w:ascii="Castellar" w:hAnsi="Castellar"/>
-          <w:b/>
-          <w:sz w:val="24"/>
-          <w:szCs w:val="24"/>
-          <w:lang w:val="fr-FR"/>
-        </w:rPr>
-        <w:t>Encadré par :</w:t>
+        <w:t xml:space="preserve"> Encadré par :</w:t>
       </w:r>
     </w:p>
     <w:p>
@@ -316,20 +306,8 @@
           <w:szCs w:val="24"/>
           <w:lang w:val="fr-FR"/>
         </w:rPr>
-        <w:t xml:space="preserve">M. </w:t>
+        <w:t>M. Sédrick</w:t>
       </w:r>
-      <w:proofErr w:type="spellStart"/>
-      <w:r>
-        <w:rPr>
-          <w:rFonts w:ascii="Castellar" w:hAnsi="Castellar"/>
-          <w:i/>
-          <w:sz w:val="24"/>
-          <w:szCs w:val="24"/>
-          <w:lang w:val="fr-FR"/>
-        </w:rPr>
-        <w:t>Sédrick</w:t>
-      </w:r>
-      <w:proofErr w:type="spellEnd"/>
     </w:p>
     <w:p>
       <w:pPr>
@@ -490,14 +468,14 @@
           <w:lang w:val="fr-FR"/>
         </w:rPr>
       </w:pPr>
-      <w:bookmarkStart w:id="0" w:name="_GoBack"/>
-      <w:bookmarkEnd w:id="0"/>
       <w:r>
         <w:rPr>
           <w:lang w:val="fr-FR"/>
         </w:rPr>
         <w:br w:type="column"/>
       </w:r>
+      <w:bookmarkStart w:id="0" w:name="_GoBack"/>
+      <w:bookmarkEnd w:id="0"/>
     </w:p>
     <w:sdt>
       <w:sdtPr>
@@ -1500,21 +1478,7 @@
           <w:lang w:val="fr-FR"/>
         </w:rPr>
         <w:br/>
-        <w:t xml:space="preserve">Ce transport est actuellement géré de manière </w:t>
-      </w:r>
-      <w:proofErr w:type="spellStart"/>
-      <w:r>
-        <w:rPr>
-          <w:lang w:val="fr-FR"/>
-        </w:rPr>
-        <w:t>semi-manuelle</w:t>
-      </w:r>
-      <w:proofErr w:type="spellEnd"/>
-      <w:r>
-        <w:rPr>
-          <w:lang w:val="fr-FR"/>
-        </w:rPr>
-        <w:t>, ce qui motive le développement de l’application AGTS (Application de Gestion de Transport Scolaire).</w:t>
+        <w:t>Ce transport est actuellement géré de manière semi-manuelle, ce qui motive le développement de l’application AGTS (Application de Gestion de Transport Scolaire).</w:t>
       </w:r>
       <w:r>
         <w:rPr>
@@ -2292,6 +2256,12 @@
       <w:footerReference w:type="default" r:id="rId12"/>
       <w:pgSz w:w="12240" w:h="15840"/>
       <w:pgMar w:top="1440" w:right="1800" w:bottom="1440" w:left="1800" w:header="720" w:footer="720" w:gutter="0"/>
+      <w:pgBorders w:display="firstPage" w:offsetFrom="page">
+        <w:top w:val="thinThickSmallGap" w:sz="24" w:space="24" w:color="auto"/>
+        <w:left w:val="double" w:sz="4" w:space="24" w:color="auto"/>
+        <w:bottom w:val="thinThickMediumGap" w:sz="24" w:space="24" w:color="auto"/>
+        <w:right w:val="double" w:sz="4" w:space="24" w:color="auto"/>
+      </w:pgBorders>
       <w:cols w:space="720"/>
       <w:docGrid w:linePitch="360"/>
     </w:sectPr>
@@ -2334,6 +2304,7 @@
         <w:docPartUnique/>
       </w:docPartObj>
     </w:sdtPr>
+    <w:sdtEndPr/>
     <w:sdtContent>
       <w:p>
         <w:pPr>
@@ -2354,7 +2325,7 @@
             <w:noProof/>
             <w:lang w:val="fr-FR"/>
           </w:rPr>
-          <w:t>3</w:t>
+          <w:t>2</w:t>
         </w:r>
         <w:r>
           <w:fldChar w:fldCharType="end"/>
@@ -14568,7 +14539,7 @@
 </file>
 
 <file path=customXml/itemProps1.xml><?xml version="1.0" encoding="utf-8"?>
-<ds:datastoreItem xmlns:ds="http://schemas.openxmlformats.org/officeDocument/2006/customXml" ds:itemID="{09A74179-5BA5-4DB9-BDCC-92C919A2CEEA}">
+<ds:datastoreItem xmlns:ds="http://schemas.openxmlformats.org/officeDocument/2006/customXml" ds:itemID="{194DD879-9A68-482A-BE87-C6FA8A6F235F}">
   <ds:schemaRefs>
     <ds:schemaRef ds:uri="http://schemas.openxmlformats.org/officeDocument/2006/bibliography"/>
   </ds:schemaRefs>

</xml_diff>